<commit_message>
task133 realism repair 3: remaining term pinned under payment pauses and past maturity, Office theme parts, development-sample chronology, working-document wording and AASB 9 clauses, extract residue (overseas addresses, unrecorded reasons, weekly status batch), measured docx statistics, service-account register; allowance unchanged at AUD 13,773,000
Co-Authored-By: Claude Opus 5.5 <noreply@anthropic.com>
Claude-Session: https://claude.ai/code/session_01A6XcFx5t62c7gPi1bBKcVi
</commit_message>
<xml_diff>
--- a/task133/target/CRM-ECL-04_expected_credit_loss_personal_loans.docx
+++ b/task133/target/CRM-ECL-04_expected_credit_loss_personal_loans.docx
@@ -442,7 +442,17 @@
     </w:p>
     <w:p>
       <w:r>
-        <w:t>1.5 The gross carrying amount of a loan is its current balance in the loan system.</w:t>
+        <w:t>1.5 The gross carrying amount of a loan is its current balance in the loan system, with no adjustment for establishment fees (3.6).</w:t>
+      </w:r>
+    </w:p>
+    <w:p>
+      <w:r>
+        <w:t>1.6 The coverage ratio of a group of loans is its allowance as a percentage of its gross carrying amount.</w:t>
+      </w:r>
+    </w:p>
+    <w:p>
+      <w:r>
+        <w:t>1.7 A hardship arrangement under HP-01 varies a loan's repayments for a period. It is a modification that does not derecognise the loan: the loan keeps its contract rate and maturity date, and the modification gain or loss is immaterial and is not recognised.</w:t>
       </w:r>
     </w:p>
     <w:p>
@@ -455,7 +465,19 @@
     </w:p>
     <w:p>
       <w:r>
-        <w:t>2.1 A loan is in stage 2 if, at the reporting date, any of the following holds: it is 30 or more days past due; a hardship arrangement is in force; or its current behaviour score is 60 or more points below its score at origination, both on the current (v4) scorecard. Otherwise it is in stage 1.</w:t>
+        <w:t xml:space="preserve">2.1 A loan is in stage 2 if, at the reporting date, any of the following holds: it is 30 or more days past due; </w:t>
+      </w:r>
+      <w:r>
+        <w:t xml:space="preserve">a hardship arrangement is in force; </w:t>
+      </w:r>
+      <w:r>
+        <w:t xml:space="preserve">or its current behaviour score is 60 or more points below its score at origination, </w:t>
+      </w:r>
+      <w:r>
+        <w:t>both on the current (v4) scorecard</w:t>
+      </w:r>
+      <w:r>
+        <w:t>. Otherwise it is in stage 1.</w:t>
       </w:r>
     </w:p>
     <w:p>
@@ -470,12 +492,16 @@
     </w:p>
     <w:p>
       <w:r>
-        <w:t>2.4 Transfers between stages are symmetrical, with no probation period. A loan returns to stage 1 at the first reporting date on which none of the conditions in 2.1 holds, and a loan that is no longer 90 or more days past due is staged under 2.1.</w:t>
-      </w:r>
-    </w:p>
-    <w:p>
-      <w:r>
-        <w:t>2.5 The 30 days past due backstop in AASB 9 5.5.11 is not rebutted.</w:t>
+        <w:t xml:space="preserve">2.4 Transfers between stages are symmetrical. A loan returns to stage 1 at the first reporting date on which none of the conditions in 2.1 holds, and a loan that is no longer 90 or more days past due is staged under 2.1. </w:t>
+      </w:r>
+      <w:r>
+        <w:t>There is no probation period, because the behaviour score already reflects a loan's recent repayment conduct.</w:t>
+      </w:r>
+    </w:p>
+    <w:p>
+      <w:r>
+        <w:lastRenderedPageBreak/>
+        <w:t>2.5 The presumption in AASB 9 5.5.11 that credit risk has increased significantly when contractual payments are more than 30 days past due is not rebutted; the 30 or more days past due condition in 2.1 meets it.</w:t>
       </w:r>
     </w:p>
     <w:p>
@@ -493,13 +519,36 @@
     </w:p>
     <w:p>
       <w:r>
-        <w:lastRenderedPageBreak/>
-        <w:t>3.2 PD(k), the probability of default in the k-th month after the reporting date, comes from the model team's cumulative default curve for the loan's product. Stage 2 loans carry the significant-increase scalar of 2.4 on PD(k). A loan's remaining term is its contractual term less the number of monthly repayments that have fallen due on or before the reporting date. A loan past its contractual maturity that is not in stage 3 has a remaining term of one month.</w:t>
-      </w:r>
-    </w:p>
-    <w:p>
-      <w:r>
-        <w:t>3.3 LGD is 70 per cent for PL36 and 76 per cent for PL60.</w:t>
+        <w:t xml:space="preserve">3.2 PD(k), the probability of default in the k-th month after the reporting date, </w:t>
+      </w:r>
+      <w:r>
+        <w:t>comes from the model team's cumulative default curve for the loan's product.</w:t>
+      </w:r>
+      <w:r>
+        <w:t xml:space="preserve"> </w:t>
+      </w:r>
+      <w:r>
+        <w:t xml:space="preserve">Stage 2 loans carry the significant-increase scalar of 2.4 on PD(k). </w:t>
+      </w:r>
+      <w:r>
+        <w:t xml:space="preserve">A loan's remaining term is its contractual term less the number of monthly repayments that have fallen due on or before the reporting date. </w:t>
+      </w:r>
+      <w:r>
+        <w:t xml:space="preserve">Repayment dates during a payment pause count as repayments fallen due, because a pause does not change the repayment schedule or the maturity date. </w:t>
+      </w:r>
+      <w:r>
+        <w:t>A loan past its contractual maturity that is not in stage 3 is treated as being in the final month of its term, with a remaining term of one month.</w:t>
+      </w:r>
+    </w:p>
+    <w:p>
+      <w:r>
+        <w:t xml:space="preserve">3.3 LGD is 70 per cent for PL36 and </w:t>
+      </w:r>
+      <w:r>
+        <w:t>76 per cent</w:t>
+      </w:r>
+      <w:r>
+        <w:t xml:space="preserve"> for PL60.</w:t>
       </w:r>
     </w:p>
     <w:p>
@@ -514,7 +563,12 @@
     </w:p>
     <w:p>
       <w:r>
-        <w:t>3.6 ECL is calculated loan by loan and summed without rounding. Amounts are rounded only for reporting.</w:t>
+        <w:t>3.6 The contract rate is used as the effective interest rate. Establishment fees are taken to income when charged and are not deferred into the effective interest rate, because the effect on interest income and on the gross carrying amount is immaterial; the Chief Financial Officer approved this treatment in November 2019 and Group Finance confirms it at each year end.</w:t>
+      </w:r>
+    </w:p>
+    <w:p>
+      <w:r>
+        <w:t>3.7 ECL is calculated for each loan and the allowance is their total; figures are rounded only when they are reported.</w:t>
       </w:r>
     </w:p>
     <w:p>
@@ -540,7 +594,7 @@
     </w:p>
     <w:p>
       <w:r>
-        <w:t>The allowance is reported to the Audit and Risk Committee in Australian dollars by stage and product, with the coverage ratio (allowance over gross carrying amount, the sum of current balances) for each.</w:t>
+        <w:t>The allowance is reported to the Audit and Risk Committee in Australian dollars by stage and product, with the coverage ratio for each.</w:t>
       </w:r>
     </w:p>
     <w:p>
@@ -581,6 +635,7 @@
     </w:p>
     <w:p>
       <w:r>
+        <w:lastRenderedPageBreak/>
         <w:t>7.4 EAD assumes the current balance is repaid on schedule. Extra repayments, payouts and hardship variations after the reporting date are not modelled.</w:t>
       </w:r>
     </w:p>
@@ -933,7 +988,6 @@
         <w:pStyle w:val="Heading2"/>
       </w:pPr>
       <w:r>
-        <w:lastRenderedPageBreak/>
         <w:t>8.3 Version history</w:t>
       </w:r>
     </w:p>
@@ -2104,34 +2158,34 @@
         <a:sysClr val="window" lastClr="FFFFFF"/>
       </a:lt1>
       <a:dk2>
-        <a:srgbClr val="1F497D"/>
+        <a:srgbClr val="44546A"/>
       </a:dk2>
       <a:lt2>
-        <a:srgbClr val="EEECE1"/>
+        <a:srgbClr val="E7E6E6"/>
       </a:lt2>
       <a:accent1>
-        <a:srgbClr val="4F81BD"/>
+        <a:srgbClr val="4472C4"/>
       </a:accent1>
       <a:accent2>
-        <a:srgbClr val="C0504D"/>
+        <a:srgbClr val="ED7D31"/>
       </a:accent2>
       <a:accent3>
-        <a:srgbClr val="9BBB59"/>
+        <a:srgbClr val="A5A5A5"/>
       </a:accent3>
       <a:accent4>
-        <a:srgbClr val="8064A2"/>
+        <a:srgbClr val="FFC000"/>
       </a:accent4>
       <a:accent5>
-        <a:srgbClr val="4BACC6"/>
+        <a:srgbClr val="5B9BD5"/>
       </a:accent5>
       <a:accent6>
-        <a:srgbClr val="F79646"/>
+        <a:srgbClr val="70AD47"/>
       </a:accent6>
       <a:hlink>
-        <a:srgbClr val="0000FF"/>
+        <a:srgbClr val="0563C1"/>
       </a:hlink>
       <a:folHlink>
-        <a:srgbClr val="800080"/>
+        <a:srgbClr val="954F72"/>
       </a:folHlink>
     </a:clrScheme>
     <a:fontScheme name="Office">
@@ -2139,13 +2193,13 @@
         <a:latin typeface="Calibri Light" panose="020F0302020204030204"/>
         <a:ea typeface=""/>
         <a:cs typeface=""/>
-        <a:font script="Jpan" typeface="ＭＳ Ｐゴシック"/>
+        <a:font script="Jpan" typeface="游ゴシック Light"/>
         <a:font script="Hang" typeface="맑은 고딕"/>
-        <a:font script="Hans" typeface="宋体"/>
+        <a:font script="Hans" typeface="等线 Light"/>
         <a:font script="Hant" typeface="新細明體"/>
         <a:font script="Arab" typeface="Times New Roman"/>
         <a:font script="Hebr" typeface="Times New Roman"/>
-        <a:font script="Thai" typeface="Tahoma"/>
+        <a:font script="Thai" typeface="Angsana New"/>
         <a:font script="Ethi" typeface="Nyala"/>
         <a:font script="Beng" typeface="Vrinda"/>
         <a:font script="Gujr" typeface="Shruti"/>
@@ -2168,18 +2222,36 @@
         <a:font script="Mong" typeface="Mongolian Baiti"/>
         <a:font script="Viet" typeface="Times New Roman"/>
         <a:font script="Uigh" typeface="Microsoft Uighur"/>
+        <a:font script="Geor" typeface="Sylfaen"/>
+        <a:font script="Armn" typeface="Arial"/>
+        <a:font script="Bugi" typeface="Leelawadee UI"/>
+        <a:font script="Bopo" typeface="Microsoft JhengHei"/>
+        <a:font script="Java" typeface="Javanese Text"/>
+        <a:font script="Lisu" typeface="Segoe UI"/>
+        <a:font script="Mymr" typeface="Myanmar Text"/>
+        <a:font script="Nkoo" typeface="Ebrima"/>
+        <a:font script="Olck" typeface="Nirmala UI"/>
+        <a:font script="Osma" typeface="Ebrima"/>
+        <a:font script="Phag" typeface="Phagspa"/>
+        <a:font script="Syrn" typeface="Estrangelo Edessa"/>
+        <a:font script="Syrj" typeface="Estrangelo Edessa"/>
+        <a:font script="Syre" typeface="Estrangelo Edessa"/>
+        <a:font script="Sora" typeface="Nirmala UI"/>
+        <a:font script="Tale" typeface="Microsoft Tai Le"/>
+        <a:font script="Talu" typeface="Microsoft New Tai Lue"/>
+        <a:font script="Tfng" typeface="Ebrima"/>
       </a:majorFont>
       <a:minorFont>
         <a:latin typeface="Calibri" panose="020F0502020204030204"/>
         <a:ea typeface=""/>
         <a:cs typeface=""/>
-        <a:font script="Jpan" typeface="ＭＳ Ｐゴシック"/>
+        <a:font script="Jpan" typeface="游明朝"/>
         <a:font script="Hang" typeface="맑은 고딕"/>
-        <a:font script="Hans" typeface="宋体"/>
+        <a:font script="Hans" typeface="等线"/>
         <a:font script="Hant" typeface="新細明體"/>
         <a:font script="Arab" typeface="Arial"/>
         <a:font script="Hebr" typeface="Arial"/>
-        <a:font script="Thai" typeface="Tahoma"/>
+        <a:font script="Thai" typeface="Cordia New"/>
         <a:font script="Ethi" typeface="Nyala"/>
         <a:font script="Beng" typeface="Vrinda"/>
         <a:font script="Gujr" typeface="Shruti"/>
@@ -2202,6 +2274,24 @@
         <a:font script="Mong" typeface="Mongolian Baiti"/>
         <a:font script="Viet" typeface="Arial"/>
         <a:font script="Uigh" typeface="Microsoft Uighur"/>
+        <a:font script="Geor" typeface="Sylfaen"/>
+        <a:font script="Armn" typeface="Arial"/>
+        <a:font script="Bugi" typeface="Leelawadee UI"/>
+        <a:font script="Bopo" typeface="Microsoft JhengHei"/>
+        <a:font script="Java" typeface="Javanese Text"/>
+        <a:font script="Lisu" typeface="Segoe UI"/>
+        <a:font script="Mymr" typeface="Myanmar Text"/>
+        <a:font script="Nkoo" typeface="Ebrima"/>
+        <a:font script="Olck" typeface="Nirmala UI"/>
+        <a:font script="Osma" typeface="Ebrima"/>
+        <a:font script="Phag" typeface="Phagspa"/>
+        <a:font script="Syrn" typeface="Estrangelo Edessa"/>
+        <a:font script="Syrj" typeface="Estrangelo Edessa"/>
+        <a:font script="Syre" typeface="Estrangelo Edessa"/>
+        <a:font script="Sora" typeface="Nirmala UI"/>
+        <a:font script="Tale" typeface="Microsoft Tai Le"/>
+        <a:font script="Talu" typeface="Microsoft New Tai Lue"/>
+        <a:font script="Tfng" typeface="Ebrima"/>
       </a:minorFont>
     </a:fontScheme>
     <a:fmtScheme name="Office">
@@ -2213,165 +2303,141 @@
           <a:gsLst>
             <a:gs pos="0">
               <a:schemeClr val="phClr">
-                <a:tint val="50000"/>
-                <a:satMod val="300000"/>
+                <a:lumMod val="110000"/>
+                <a:satMod val="105000"/>
+                <a:tint val="67000"/>
               </a:schemeClr>
             </a:gs>
-            <a:gs pos="35000">
+            <a:gs pos="50000">
               <a:schemeClr val="phClr">
-                <a:tint val="37000"/>
-                <a:satMod val="300000"/>
+                <a:lumMod val="105000"/>
+                <a:satMod val="103000"/>
+                <a:tint val="73000"/>
               </a:schemeClr>
             </a:gs>
             <a:gs pos="100000">
               <a:schemeClr val="phClr">
-                <a:tint val="15000"/>
-                <a:satMod val="350000"/>
+                <a:lumMod val="105000"/>
+                <a:satMod val="109000"/>
+                <a:tint val="81000"/>
               </a:schemeClr>
             </a:gs>
           </a:gsLst>
-          <a:lin ang="16200000" scaled="1"/>
+          <a:lin ang="5400000" scaled="0"/>
         </a:gradFill>
         <a:gradFill rotWithShape="1">
           <a:gsLst>
             <a:gs pos="0">
               <a:schemeClr val="phClr">
-                <a:shade val="51000"/>
-                <a:satMod val="130000"/>
+                <a:satMod val="103000"/>
+                <a:lumMod val="102000"/>
+                <a:tint val="94000"/>
               </a:schemeClr>
             </a:gs>
-            <a:gs pos="80000">
+            <a:gs pos="50000">
               <a:schemeClr val="phClr">
-                <a:shade val="93000"/>
-                <a:satMod val="130000"/>
+                <a:satMod val="110000"/>
+                <a:lumMod val="100000"/>
+                <a:shade val="100000"/>
               </a:schemeClr>
             </a:gs>
             <a:gs pos="100000">
               <a:schemeClr val="phClr">
-                <a:shade val="94000"/>
-                <a:satMod val="135000"/>
+                <a:lumMod val="99000"/>
+                <a:satMod val="120000"/>
+                <a:shade val="78000"/>
               </a:schemeClr>
             </a:gs>
           </a:gsLst>
-          <a:lin ang="16200000" scaled="0"/>
+          <a:lin ang="5400000" scaled="0"/>
         </a:gradFill>
       </a:fillStyleLst>
       <a:lnStyleLst>
-        <a:ln w="9525" cap="flat" cmpd="sng" algn="ctr">
-          <a:solidFill>
-            <a:schemeClr val="phClr">
-              <a:shade val="95000"/>
-              <a:satMod val="105000"/>
-            </a:schemeClr>
-          </a:solidFill>
-          <a:prstDash val="solid"/>
-        </a:ln>
-        <a:ln w="25400" cap="flat" cmpd="sng" algn="ctr">
+        <a:ln w="6350" cap="flat" cmpd="sng" algn="ctr">
           <a:solidFill>
             <a:schemeClr val="phClr"/>
           </a:solidFill>
           <a:prstDash val="solid"/>
+          <a:miter lim="800000"/>
         </a:ln>
-        <a:ln w="38100" cap="flat" cmpd="sng" algn="ctr">
+        <a:ln w="12700" cap="flat" cmpd="sng" algn="ctr">
           <a:solidFill>
             <a:schemeClr val="phClr"/>
           </a:solidFill>
           <a:prstDash val="solid"/>
+          <a:miter lim="800000"/>
+        </a:ln>
+        <a:ln w="19050" cap="flat" cmpd="sng" algn="ctr">
+          <a:solidFill>
+            <a:schemeClr val="phClr"/>
+          </a:solidFill>
+          <a:prstDash val="solid"/>
+          <a:miter lim="800000"/>
         </a:ln>
       </a:lnStyleLst>
       <a:effectStyleLst>
         <a:effectStyle>
+          <a:effectLst/>
+        </a:effectStyle>
+        <a:effectStyle>
+          <a:effectLst/>
+        </a:effectStyle>
+        <a:effectStyle>
           <a:effectLst>
-            <a:outerShdw blurRad="40000" dist="20000" dir="5400000" rotWithShape="0">
+            <a:outerShdw blurRad="57150" dist="19050" dir="5400000" algn="ctr" rotWithShape="0">
               <a:srgbClr val="000000">
-                <a:alpha val="38000"/>
+                <a:alpha val="63000"/>
               </a:srgbClr>
             </a:outerShdw>
           </a:effectLst>
-        </a:effectStyle>
-        <a:effectStyle>
-          <a:effectLst>
-            <a:outerShdw blurRad="40000" dist="23000" dir="5400000" rotWithShape="0">
-              <a:srgbClr val="000000">
-                <a:alpha val="35000"/>
-              </a:srgbClr>
-            </a:outerShdw>
-          </a:effectLst>
-        </a:effectStyle>
-        <a:effectStyle>
-          <a:effectLst>
-            <a:outerShdw blurRad="40000" dist="23000" dir="5400000" rotWithShape="0">
-              <a:srgbClr val="000000">
-                <a:alpha val="35000"/>
-              </a:srgbClr>
-            </a:outerShdw>
-          </a:effectLst>
-          <a:scene3d>
-            <a:camera prst="orthographicFront">
-              <a:rot lat="0" lon="0" rev="0"/>
-            </a:camera>
-            <a:lightRig rig="threePt" dir="t">
-              <a:rot lat="0" lon="0" rev="1200000"/>
-            </a:lightRig>
-          </a:scene3d>
-          <a:sp3d>
-            <a:bevelT w="63500" h="25400"/>
-          </a:sp3d>
         </a:effectStyle>
       </a:effectStyleLst>
       <a:bgFillStyleLst>
         <a:solidFill>
           <a:schemeClr val="phClr"/>
         </a:solidFill>
+        <a:solidFill>
+          <a:schemeClr val="phClr">
+            <a:tint val="95000"/>
+            <a:satMod val="170000"/>
+          </a:schemeClr>
+        </a:solidFill>
         <a:gradFill rotWithShape="1">
           <a:gsLst>
             <a:gs pos="0">
               <a:schemeClr val="phClr">
-                <a:tint val="40000"/>
-                <a:satMod val="350000"/>
+                <a:tint val="93000"/>
+                <a:satMod val="150000"/>
+                <a:shade val="98000"/>
+                <a:lumMod val="102000"/>
               </a:schemeClr>
             </a:gs>
-            <a:gs pos="40000">
+            <a:gs pos="50000">
               <a:schemeClr val="phClr">
-                <a:tint val="45000"/>
-                <a:shade val="99000"/>
-                <a:satMod val="350000"/>
+                <a:tint val="98000"/>
+                <a:satMod val="130000"/>
+                <a:shade val="90000"/>
+                <a:lumMod val="103000"/>
               </a:schemeClr>
             </a:gs>
             <a:gs pos="100000">
               <a:schemeClr val="phClr">
-                <a:shade val="20000"/>
-                <a:satMod val="255000"/>
+                <a:shade val="63000"/>
+                <a:satMod val="120000"/>
               </a:schemeClr>
             </a:gs>
           </a:gsLst>
-          <a:path path="circle">
-            <a:fillToRect l="50000" t="-80000" r="50000" b="180000"/>
-          </a:path>
-        </a:gradFill>
-        <a:gradFill rotWithShape="1">
-          <a:gsLst>
-            <a:gs pos="0">
-              <a:schemeClr val="phClr">
-                <a:tint val="80000"/>
-                <a:satMod val="300000"/>
-              </a:schemeClr>
-            </a:gs>
-            <a:gs pos="100000">
-              <a:schemeClr val="phClr">
-                <a:shade val="30000"/>
-                <a:satMod val="200000"/>
-              </a:schemeClr>
-            </a:gs>
-          </a:gsLst>
-          <a:path path="circle">
-            <a:fillToRect l="50000" t="50000" r="50000" b="50000"/>
-          </a:path>
+          <a:lin ang="5400000" scaled="0"/>
         </a:gradFill>
       </a:bgFillStyleLst>
     </a:fmtScheme>
   </a:themeElements>
   <a:objectDefaults/>
   <a:extraClrSchemeLst/>
+  <a:extLst>
+    <a:ext uri="{05A4C25C-085E-4340-85A3-A5531E510DB2}">
+      <thm15:themeFamily xmlns:thm15="http://schemas.microsoft.com/office/thememl/2012/main" name="Office Theme" id="{62F939B6-93AF-4DB8-9C6B-D6C7DFDC589F}" vid="{4A3C46E8-61CC-4603-A589-7422A47A8E4A}"/>
+    </a:ext>
+  </a:extLst>
 </a:theme>
 </file>
</xml_diff>

<commit_message>
task133 loop 1: rebuilt pack, goldens and target.zip
Fifteen input files (five new: the June quarter-end extract, the scoring
runs, the 2023-24 defaults, the receipts ledger, the debt-sale schedule);
distractors are now the roll-rate workbook and the write-off file. Golden
allowance AUD 13,160,000 (stage 1 10,563,000, stage 2 2,597,000); the
workbook carries the realised-loss grid and the migration counts, the
deck's second slide the stacked migration chart. Two scratch rebuilds are
byte-identical to target/, golden/ and target.zip.

Co-Authored-By: Claude Opus 5.5 <noreply@anthropic.com>
Claude-Session: https://claude.ai/code/session_01A6XcFx5t62c7gPi1bBKcVi
</commit_message>
<xml_diff>
--- a/task133/target/CRM-ECL-04_expected_credit_loss_personal_loans.docx
+++ b/task133/target/CRM-ECL-04_expected_credit_loss_personal_loans.docx
@@ -157,7 +157,7 @@
                 <w:sz w:val="19"/>
                 <w:szCs w:val="19"/>
               </w:rPr>
-              <w:t>4.1</w:t>
+              <w:t>4.2</w:t>
             </w:r>
           </w:p>
         </w:tc>
@@ -239,7 +239,7 @@
                 <w:sz w:val="19"/>
                 <w:szCs w:val="19"/>
               </w:rPr>
-              <w:t>Reporting dates from 30 June 2026</w:t>
+              <w:t>Reporting dates from 30 September 2026</w:t>
             </w:r>
           </w:p>
         </w:tc>
@@ -427,7 +427,13 @@
     </w:p>
     <w:p>
       <w:r>
-        <w:t>1.2 A loan is in default when it is 90 or more days past due. The 90-day presumption in AASB 9 B5.5.37 is not rebutted for this portfolio, and loans in default are in stage 3.</w:t>
+        <w:t xml:space="preserve">1.2 A loan is in default when it is 90 or more days past due. </w:t>
+      </w:r>
+      <w:r>
+        <w:t xml:space="preserve">The default is recorded at the first month end at which the loan is 90 or more days past due. </w:t>
+      </w:r>
+      <w:r>
+        <w:t>The 90-day presumption in AASB 9 B5.5.37 is not rebutted for this portfolio, and loans in default are in stage 3.</w:t>
       </w:r>
     </w:p>
     <w:p>
@@ -471,7 +477,13 @@
         <w:t xml:space="preserve">a hardship arrangement is in force; </w:t>
       </w:r>
       <w:r>
-        <w:t xml:space="preserve">or its current behaviour score is 60 or more points below its score at origination, </w:t>
+        <w:t xml:space="preserve">or its </w:t>
+      </w:r>
+      <w:r>
+        <w:t>behaviour score from the month-end scoring run on the position at the reporting date</w:t>
+      </w:r>
+      <w:r>
+        <w:t xml:space="preserve"> is 60 or more points below its score at origination, </w:t>
       </w:r>
       <w:r>
         <w:t>both on the current (v4) scorecard</w:t>
@@ -482,7 +494,10 @@
     </w:p>
     <w:p>
       <w:r>
-        <w:t>2.2 A hardship arrangement is in force if the reporting date falls on or between its start and end dates and it was not cancelled.</w:t>
+        <w:t xml:space="preserve">2.2 A hardship arrangement is in force </w:t>
+      </w:r>
+      <w:r>
+        <w:t>from its start date to its end date, both included, and stops being in force on the day it is cancelled.</w:t>
       </w:r>
     </w:p>
     <w:p>
@@ -492,6 +507,7 @@
     </w:p>
     <w:p>
       <w:r>
+        <w:lastRenderedPageBreak/>
         <w:t xml:space="preserve">2.4 Transfers between stages are symmetrical. A loan returns to stage 1 at the first reporting date on which none of the conditions in 2.1 holds, and a loan that is no longer 90 or more days past due is staged under 2.1. </w:t>
       </w:r>
       <w:r>
@@ -500,7 +516,6 @@
     </w:p>
     <w:p>
       <w:r>
-        <w:lastRenderedPageBreak/>
         <w:t>2.5 The presumption in AASB 9 5.5.11 that credit risk has increased significantly when contractual payments are more than 30 days past due is not rebutted; the 30 or more days past due condition in 2.1 meets it.</w:t>
       </w:r>
     </w:p>
@@ -548,7 +563,10 @@
         <w:t>76 per cent</w:t>
       </w:r>
       <w:r>
-        <w:t xml:space="preserve"> for PL60.</w:t>
+        <w:t xml:space="preserve"> for PL60. </w:t>
+      </w:r>
+      <w:r>
+        <w:t>Each year it is set against what defaults have actually lost: the share of the balance at default that has not been recovered. Every amount received after default up to the reporting date, including proceeds from a sale of the debt, counts at the end of the month in which it is received and is discounted to the default month end at the contract rate for each whole month between the two. A loan that returns to performing is treated as recovering its balance at default in full.</w:t>
       </w:r>
     </w:p>
     <w:p>
@@ -620,6 +638,7 @@
     </w:p>
     <w:p>
       <w:r>
+        <w:lastRenderedPageBreak/>
         <w:t>7.1 PD is set by product only. Risk grade, channel and state do not enter it.</w:t>
       </w:r>
     </w:p>
@@ -635,8 +654,10 @@
     </w:p>
     <w:p>
       <w:r>
-        <w:lastRenderedPageBreak/>
-        <w:t>7.4 EAD assumes the current balance is repaid on schedule. Extra repayments, payouts and hardship variations after the reporting date are not modelled.</w:t>
+        <w:t xml:space="preserve">7.4 </w:t>
+      </w:r>
+      <w:r>
+        <w:t>EAD(k) follows the repayment schedule; extra repayments and hardship variations after the reporting date do not change it.</w:t>
       </w:r>
     </w:p>
     <w:p>
@@ -798,7 +819,7 @@
                 <w:sz w:val="19"/>
                 <w:szCs w:val="19"/>
               </w:rPr>
-              <w:t>12 May 2026</w:t>
+              <w:t>4 August 2026</w:t>
             </w:r>
           </w:p>
         </w:tc>
@@ -857,7 +878,7 @@
                 <w:sz w:val="19"/>
                 <w:szCs w:val="19"/>
               </w:rPr>
-              <w:t>15 May 2026</w:t>
+              <w:t>7 August 2026</w:t>
             </w:r>
           </w:p>
         </w:tc>
@@ -916,7 +937,7 @@
                 <w:sz w:val="19"/>
                 <w:szCs w:val="19"/>
               </w:rPr>
-              <w:t>19 May 2026</w:t>
+              <w:t>12 August 2026</w:t>
             </w:r>
           </w:p>
         </w:tc>
@@ -972,7 +993,7 @@
                 <w:sz w:val="19"/>
                 <w:szCs w:val="19"/>
               </w:rPr>
-              <w:t>26 May 2026</w:t>
+              <w:t>25 August 2026</w:t>
             </w:r>
           </w:p>
         </w:tc>
@@ -1375,6 +1396,7 @@
           </w:tcPr>
           <w:p>
             <w:pPr>
+              <w:keepNext/>
               <w:spacing w:before="40" w:after="40"/>
             </w:pPr>
             <w:r>
@@ -1392,6 +1414,7 @@
           </w:tcPr>
           <w:p>
             <w:pPr>
+              <w:keepNext/>
               <w:spacing w:before="40" w:after="40"/>
             </w:pPr>
             <w:r>
@@ -1409,6 +1432,7 @@
           </w:tcPr>
           <w:p>
             <w:pPr>
+              <w:keepNext/>
               <w:spacing w:before="40" w:after="40"/>
             </w:pPr>
             <w:r>
@@ -1417,6 +1441,62 @@
                 <w:szCs w:val="19"/>
               </w:rPr>
               <w:t>Hardship arrangements added to the stage 2 conditions; LGD for PL60 raised from 74 to 76 per cent; the allowance reported to the Board after the Audit and Risk Committee's review</w:t>
+            </w:r>
+          </w:p>
+        </w:tc>
+      </w:tr>
+      <w:tr>
+        <w:trPr>
+          <w:cantSplit/>
+        </w:trPr>
+        <w:tc>
+          <w:tcPr>
+            <w:tcW w:w="1100" w:type="dxa"/>
+          </w:tcPr>
+          <w:p>
+            <w:pPr>
+              <w:spacing w:before="40" w:after="40"/>
+            </w:pPr>
+            <w:r>
+              <w:rPr>
+                <w:sz w:val="19"/>
+                <w:szCs w:val="19"/>
+              </w:rPr>
+              <w:t>4.2</w:t>
+            </w:r>
+          </w:p>
+        </w:tc>
+        <w:tc>
+          <w:tcPr>
+            <w:tcW w:w="1300" w:type="dxa"/>
+          </w:tcPr>
+          <w:p>
+            <w:pPr>
+              <w:spacing w:before="40" w:after="40"/>
+            </w:pPr>
+            <w:r>
+              <w:rPr>
+                <w:sz w:val="19"/>
+                <w:szCs w:val="19"/>
+              </w:rPr>
+              <w:t>Aug 2026</w:t>
+            </w:r>
+          </w:p>
+        </w:tc>
+        <w:tc>
+          <w:tcPr>
+            <w:tcW w:w="6600" w:type="dxa"/>
+          </w:tcPr>
+          <w:p>
+            <w:pPr>
+              <w:spacing w:before="40" w:after="40"/>
+            </w:pPr>
+            <w:r>
+              <w:rPr>
+                <w:sz w:val="19"/>
+                <w:szCs w:val="19"/>
+              </w:rPr>
+              <w:t>Stage 2 conditions stated for any reporting date (the scoring run, hardship arrangements in force); default dated to the month end; the annual LGD review measure added to 3.3; 7.4 reworded</w:t>
             </w:r>
           </w:p>
         </w:tc>
@@ -1446,7 +1526,7 @@
       <w:pStyle w:val="Footer"/>
     </w:pPr>
     <w:r>
-      <w:t xml:space="preserve">Version 4.1  |  Internal  |  Uncontrolled when printed</w:t>
+      <w:t xml:space="preserve">Version 4.2  |  Internal  |  Uncontrolled when printed</w:t>
     </w:r>
     <w:r>
       <w:tab/>

</xml_diff>